<commit_message>
feat: plan nutricional de 14 dias y frontend inicial con React
</commit_message>
<xml_diff>
--- a/Prompts/PROMPT 6.docx
+++ b/Prompts/PROMPT 6.docx
@@ -7,7 +7,7 @@
         <w:pStyle w:val="Ttulo1"/>
       </w:pPr>
       <w:r>
-        <w:t>PROMPT 6 — GENERADOR MÍNIMO DE DIETA DIARIA</w:t>
+        <w:t>PROMPT 6 — PLAN NUTRICIONAL DE 14 DÍAS + PRIMERA INTERFAZ LOCAL</w:t>
       </w:r>
     </w:p>
     <w:p/>
@@ -19,7 +19,12 @@
     <w:p/>
     <w:p>
       <w:r>
-        <w:t>Continuamos desde el estado REAL del proyecto después del Prompt 5.</w:t>
+        <w:t>Continuamos desde el estado REAL del proyecto después del Prompt 5 y del</w:t>
+      </w:r>
+    </w:p>
+    <w:p>
+      <w:r>
+        <w:t>generador mínimo de dieta diaria implementado posteriormente.</w:t>
       </w:r>
     </w:p>
     <w:p/>
@@ -28,6 +33,7 @@
         <w:t>ENTORNO OBLIGATORIO:</w:t>
       </w:r>
     </w:p>
+    <w:p/>
     <w:p>
       <w:r>
         <w:t>- Antigravity</w:t>
@@ -40,7 +46,12 @@
     </w:p>
     <w:p>
       <w:r>
-        <w:t>- Desarrollo local</w:t>
+        <w:t>- Desarrollo local / localhost</w:t>
+      </w:r>
+    </w:p>
+    <w:p>
+      <w:r>
+        <w:t>- Git + GitHub</w:t>
       </w:r>
     </w:p>
     <w:p/>
@@ -56,7 +67,12 @@
     </w:p>
     <w:p>
       <w:r>
-        <w:t>NO introducir mecanismos específicos de Claude Code.</w:t>
+        <w:t>NO utilizar herramientas, agentes, SDKs o configuraciones específicas de</w:t>
+      </w:r>
+    </w:p>
+    <w:p>
+      <w:r>
+        <w:t>Claude Code.</w:t>
       </w:r>
     </w:p>
     <w:p/>
@@ -65,6 +81,12 @@
         <w:t>STACK ACTUAL:</w:t>
       </w:r>
     </w:p>
+    <w:p/>
+    <w:p>
+      <w:r>
+        <w:t>Backend:</w:t>
+      </w:r>
+    </w:p>
     <w:p>
       <w:r>
         <w:t>- Python</w:t>
@@ -77,6 +99,7 @@
     </w:p>
     <w:p>
       <w:r>
+        <w:lastRenderedPageBreak/>
         <w:t>- PostgreSQL</w:t>
       </w:r>
     </w:p>
@@ -98,19 +121,24 @@
     <w:p/>
     <w:p>
       <w:r>
+        <w:t>Frontend:</w:t>
+      </w:r>
+    </w:p>
+    <w:p>
+      <w:r>
+        <w:t>- React</w:t>
+      </w:r>
+    </w:p>
+    <w:p/>
+    <w:p>
+      <w:r>
         <w:t>PROGRESIÓN ACTUAL:</w:t>
       </w:r>
     </w:p>
     <w:p/>
     <w:p>
       <w:r>
-        <w:lastRenderedPageBreak/>
-        <w:t>Infraestructura</w:t>
-      </w:r>
-    </w:p>
-    <w:p>
-      <w:r>
-        <w:t>→ Patient</w:t>
+        <w:t>Paciente</w:t>
       </w:r>
     </w:p>
     <w:p>
@@ -125,7 +153,12 @@
     </w:p>
     <w:p>
       <w:r>
-        <w:t>→ AHORA: primera dieta diaria</w:t>
+        <w:t>→ Daily Diet</w:t>
+      </w:r>
+    </w:p>
+    <w:p>
+      <w:r>
+        <w:t>→ AHORA: PLAN DE 14 DÍAS + PRIMERA UI</w:t>
       </w:r>
     </w:p>
     <w:p/>
@@ -134,60 +167,16 @@
         <w:t>IMPORTANTE:</w:t>
       </w:r>
     </w:p>
+    <w:p/>
     <w:p>
       <w:r>
         <w:t>Antes de modificar cualquier cosa, inspecciona el repositorio REAL.</w:t>
       </w:r>
     </w:p>
-    <w:p>
-      <w:r>
-        <w:t>No asumas que los archivos actuales tienen exactamente los nombres o</w:t>
-      </w:r>
-    </w:p>
-    <w:p>
-      <w:r>
-        <w:t>estructuras descritos aquí.</w:t>
-      </w:r>
-    </w:p>
-    <w:p/>
-    <w:p>
-      <w:r>
-        <w:t>OBJETIVO</w:t>
-      </w:r>
-    </w:p>
-    <w:p/>
-    <w:p>
-      <w:r>
-        <w:t>Crear el primer generador MÍNIMO de una dieta diaria.</w:t>
-      </w:r>
-    </w:p>
-    <w:p/>
-    <w:p>
-      <w:r>
-        <w:t>NO construir todavía el generador de 14 días.</w:t>
-      </w:r>
-    </w:p>
-    <w:p/>
-    <w:p>
-      <w:r>
-        <w:t>La dieta debe utilizar el objetivo nutricional existente como referencia</w:t>
-      </w:r>
-    </w:p>
-    <w:p>
-      <w:r>
-        <w:t>y producir una estructura diaria de comidas.</w:t>
-      </w:r>
-    </w:p>
-    <w:p/>
-    <w:p>
-      <w:r>
-        <w:t>1. INSPECCIÓN</w:t>
-      </w:r>
-    </w:p>
-    <w:p/>
-    <w:p>
-      <w:r>
-        <w:t>Revisa:</w:t>
+    <w:p/>
+    <w:p>
+      <w:r>
+        <w:t>Revisa especialmente:</w:t>
       </w:r>
     </w:p>
     <w:p/>
@@ -199,6 +188,16 @@
     <w:p>
       <w:r>
         <w:t>- `README.md`</w:t>
+      </w:r>
+    </w:p>
+    <w:p>
+      <w:r>
+        <w:t>- `backend/`</w:t>
+      </w:r>
+    </w:p>
+    <w:p>
+      <w:r>
+        <w:t>- `frontend/`</w:t>
       </w:r>
     </w:p>
     <w:p>
@@ -214,6 +213,16 @@
     </w:p>
     <w:p>
       <w:r>
+        <w:t>- `catalog.py`</w:t>
+      </w:r>
+    </w:p>
+    <w:p>
+      <w:r>
+        <w:t>- `diet_generator.py`</w:t>
+      </w:r>
+    </w:p>
+    <w:p>
+      <w:r>
         <w:t>- `schemas.py`</w:t>
       </w:r>
     </w:p>
@@ -224,12 +233,7 @@
     </w:p>
     <w:p>
       <w:r>
-        <w:t>- `database.py`</w:t>
-      </w:r>
-    </w:p>
-    <w:p>
-      <w:r>
-        <w:t>- tests</w:t>
+        <w:t>- tests existentes</w:t>
       </w:r>
     </w:p>
     <w:p>
@@ -239,21 +243,832 @@
     </w:p>
     <w:p>
       <w:r>
-        <w:t>- estructura actual</w:t>
-      </w:r>
-    </w:p>
-    <w:p>
-      <w:r>
         <w:t>- Git status</w:t>
       </w:r>
     </w:p>
     <w:p/>
     <w:p>
       <w:r>
-        <w:t>Entiende primero cómo se calcula actualmente:</w:t>
-      </w:r>
-    </w:p>
-    <w:p/>
+        <w:t>NO asumas que los nombres o estructuras actuales coinciden exactamente</w:t>
+      </w:r>
+    </w:p>
+    <w:p>
+      <w:r>
+        <w:t>con esta descripción.</w:t>
+      </w:r>
+    </w:p>
+    <w:p/>
+    <w:p>
+      <w:r>
+        <w:t>==================================================</w:t>
+      </w:r>
+    </w:p>
+    <w:p>
+      <w:r>
+        <w:t>OBJETIVO PRINCIPAL</w:t>
+      </w:r>
+    </w:p>
+    <w:p>
+      <w:r>
+        <w:t>==================================================</w:t>
+      </w:r>
+    </w:p>
+    <w:p/>
+    <w:p>
+      <w:r>
+        <w:t>Quiero empezar a VER el sistema funcionando en localhost.</w:t>
+      </w:r>
+    </w:p>
+    <w:p/>
+    <w:p>
+      <w:r>
+        <w:t>Construye una primera versión funcional del:</w:t>
+      </w:r>
+    </w:p>
+    <w:p/>
+    <w:p>
+      <w:r>
+        <w:t>1. PLAN NUTRICIONAL DE 14 DÍAS</w:t>
+      </w:r>
+    </w:p>
+    <w:p>
+      <w:r>
+        <w:t>2. INTERFAZ WEB MÍNIMA PARA VISUALIZARLO</w:t>
+      </w:r>
+    </w:p>
+    <w:p/>
+    <w:p>
+      <w:r>
+        <w:t>No busco todavía un producto terminado.</w:t>
+      </w:r>
+    </w:p>
+    <w:p/>
+    <w:p>
+      <w:r>
+        <w:lastRenderedPageBreak/>
+        <w:t>Busco una primera representación funcional de cómo se verá y cómo</w:t>
+      </w:r>
+    </w:p>
+    <w:p>
+      <w:r>
+        <w:t>interactuará el sistema.</w:t>
+      </w:r>
+    </w:p>
+    <w:p/>
+    <w:p>
+      <w:r>
+        <w:t>==================================================</w:t>
+      </w:r>
+    </w:p>
+    <w:p>
+      <w:r>
+        <w:t>PARTE 1 — PLAN DE 14 DÍAS</w:t>
+      </w:r>
+    </w:p>
+    <w:p>
+      <w:r>
+        <w:t>==================================================</w:t>
+      </w:r>
+    </w:p>
+    <w:p/>
+    <w:p>
+      <w:r>
+        <w:t>Utiliza el generador de dieta diaria que ya existe.</w:t>
+      </w:r>
+    </w:p>
+    <w:p/>
+    <w:p>
+      <w:r>
+        <w:t>NO reescribas el generador actual.</w:t>
+      </w:r>
+    </w:p>
+    <w:p/>
+    <w:p>
+      <w:r>
+        <w:t>Crea una capa mínima que permita generar:</w:t>
+      </w:r>
+    </w:p>
+    <w:p/>
+    <w:p>
+      <w:r>
+        <w:t>Día 1</w:t>
+      </w:r>
+    </w:p>
+    <w:p>
+      <w:r>
+        <w:t>Día 2</w:t>
+      </w:r>
+    </w:p>
+    <w:p>
+      <w:r>
+        <w:t>...</w:t>
+      </w:r>
+    </w:p>
+    <w:p>
+      <w:r>
+        <w:t>Día 14</w:t>
+      </w:r>
+    </w:p>
+    <w:p/>
+    <w:p>
+      <w:r>
+        <w:t>Cada día debe contener:</w:t>
+      </w:r>
+    </w:p>
+    <w:p/>
+    <w:p>
+      <w:r>
+        <w:t>- desayuno</w:t>
+      </w:r>
+    </w:p>
+    <w:p>
+      <w:r>
+        <w:t>- comida</w:t>
+      </w:r>
+    </w:p>
+    <w:p>
+      <w:r>
+        <w:t>- cena</w:t>
+      </w:r>
+    </w:p>
+    <w:p>
+      <w:r>
+        <w:t>- alimentos</w:t>
+      </w:r>
+    </w:p>
+    <w:p>
+      <w:r>
+        <w:t>- cantidades</w:t>
+      </w:r>
+    </w:p>
+    <w:p>
+      <w:r>
+        <w:t>- calorías</w:t>
+      </w:r>
+    </w:p>
+    <w:p>
+      <w:r>
+        <w:lastRenderedPageBreak/>
+        <w:t>- proteínas</w:t>
+      </w:r>
+    </w:p>
+    <w:p>
+      <w:r>
+        <w:t>- carbohidratos</w:t>
+      </w:r>
+    </w:p>
+    <w:p>
+      <w:r>
+        <w:t>- grasas</w:t>
+      </w:r>
+    </w:p>
+    <w:p>
+      <w:r>
+        <w:t>- totales diarios</w:t>
+      </w:r>
+    </w:p>
+    <w:p/>
+    <w:p>
+      <w:r>
+        <w:t>El plan debe utilizar el mismo objetivo nutricional calculado actualmente.</w:t>
+      </w:r>
+    </w:p>
+    <w:p/>
+    <w:p>
+      <w:r>
+        <w:t>IMPORTANTE:</w:t>
+      </w:r>
+    </w:p>
+    <w:p/>
+    <w:p>
+      <w:r>
+        <w:t>No queremos simplemente copiar exactamente la misma dieta 14 veces.</w:t>
+      </w:r>
+    </w:p>
+    <w:p/>
+    <w:p>
+      <w:r>
+        <w:t>Utiliza el catálogo existente para introducir una variación razonable entre</w:t>
+      </w:r>
+    </w:p>
+    <w:p>
+      <w:r>
+        <w:t>los días.</w:t>
+      </w:r>
+    </w:p>
+    <w:p/>
+    <w:p>
+      <w:r>
+        <w:t>No necesitas todavía un algoritmo inteligente de planificación.</w:t>
+      </w:r>
+    </w:p>
+    <w:p/>
+    <w:p>
+      <w:r>
+        <w:t>Una estrategia sencilla y determinista es suficiente.</w:t>
+      </w:r>
+    </w:p>
+    <w:p/>
+    <w:p>
+      <w:r>
+        <w:t>La generación debe ser reproducible.</w:t>
+      </w:r>
+    </w:p>
+    <w:p/>
+    <w:p>
+      <w:r>
+        <w:t>==================================================</w:t>
+      </w:r>
+    </w:p>
+    <w:p>
+      <w:r>
+        <w:t>PARTE 2 — API</w:t>
+      </w:r>
+    </w:p>
+    <w:p>
+      <w:r>
+        <w:t>==================================================</w:t>
+      </w:r>
+    </w:p>
+    <w:p/>
+    <w:p>
+      <w:r>
+        <w:t>Añade un endpoint:</w:t>
+      </w:r>
+    </w:p>
+    <w:p/>
+    <w:p>
+      <w:r>
+        <w:lastRenderedPageBreak/>
+        <w:t>GET /patients/{id}/diet-plan</w:t>
+      </w:r>
+    </w:p>
+    <w:p/>
+    <w:p>
+      <w:r>
+        <w:t>Debe permitir seleccionar el objetivo:</w:t>
+      </w:r>
+    </w:p>
+    <w:p/>
+    <w:p>
+      <w:r>
+        <w:t>maintenance</w:t>
+      </w:r>
+    </w:p>
+    <w:p>
+      <w:r>
+        <w:t>weight_loss</w:t>
+      </w:r>
+    </w:p>
+    <w:p>
+      <w:r>
+        <w:t>weight_gain</w:t>
+      </w:r>
+    </w:p>
+    <w:p/>
+    <w:p>
+      <w:r>
+        <w:t>El endpoint debe:</w:t>
+      </w:r>
+    </w:p>
+    <w:p/>
+    <w:p>
+      <w:r>
+        <w:t>1. Obtener el paciente.</w:t>
+      </w:r>
+    </w:p>
+    <w:p>
+      <w:r>
+        <w:t>2. Calcular su Nutrition Target.</w:t>
+      </w:r>
+    </w:p>
+    <w:p>
+      <w:r>
+        <w:t>3. Generar el plan de 14 días.</w:t>
+      </w:r>
+    </w:p>
+    <w:p>
+      <w:r>
+        <w:t>4. Devolver el plan completo.</w:t>
+      </w:r>
+    </w:p>
+    <w:p/>
+    <w:p>
+      <w:r>
+        <w:t>NO persistir todavía el plan en PostgreSQL.</w:t>
+      </w:r>
+    </w:p>
+    <w:p/>
+    <w:p>
+      <w:r>
+        <w:t>Debe generarse bajo demanda.</w:t>
+      </w:r>
+    </w:p>
+    <w:p/>
+    <w:p>
+      <w:r>
+        <w:t>La respuesta debe incluir:</w:t>
+      </w:r>
+    </w:p>
+    <w:p/>
+    <w:p>
+      <w:r>
+        <w:t>- paciente</w:t>
+      </w:r>
+    </w:p>
+    <w:p>
+      <w:r>
+        <w:t>- objetivo nutricional</w:t>
+      </w:r>
+    </w:p>
+    <w:p>
+      <w:r>
+        <w:t>- 14 días</w:t>
+      </w:r>
+    </w:p>
+    <w:p>
+      <w:r>
+        <w:t>- comidas</w:t>
+      </w:r>
+    </w:p>
+    <w:p>
+      <w:r>
+        <w:t>- alimentos</w:t>
+      </w:r>
+    </w:p>
+    <w:p>
+      <w:r>
+        <w:lastRenderedPageBreak/>
+        <w:t>- cantidades</w:t>
+      </w:r>
+    </w:p>
+    <w:p>
+      <w:r>
+        <w:t>- macros</w:t>
+      </w:r>
+    </w:p>
+    <w:p>
+      <w:r>
+        <w:t>- totales diarios</w:t>
+      </w:r>
+    </w:p>
+    <w:p/>
+    <w:p>
+      <w:r>
+        <w:t>También incluye los totales o resumen necesario para comprobar que el plan</w:t>
+      </w:r>
+    </w:p>
+    <w:p>
+      <w:r>
+        <w:t>respeta razonablemente el objetivo.</w:t>
+      </w:r>
+    </w:p>
+    <w:p/>
+    <w:p>
+      <w:r>
+        <w:t>==================================================</w:t>
+      </w:r>
+    </w:p>
+    <w:p>
+      <w:r>
+        <w:t>PARTE 3 — FRONTEND</w:t>
+      </w:r>
+    </w:p>
+    <w:p>
+      <w:r>
+        <w:t>==================================================</w:t>
+      </w:r>
+    </w:p>
+    <w:p/>
+    <w:p>
+      <w:r>
+        <w:t>AHORA sí quiero una primera interfaz visual en localhost.</w:t>
+      </w:r>
+    </w:p>
+    <w:p/>
+    <w:p>
+      <w:r>
+        <w:t>Inspecciona primero qué existe realmente dentro de `frontend/`.</w:t>
+      </w:r>
+    </w:p>
+    <w:p/>
+    <w:p>
+      <w:r>
+        <w:t>Si React ya está inicializado, reutilízalo.</w:t>
+      </w:r>
+    </w:p>
+    <w:p/>
+    <w:p>
+      <w:r>
+        <w:t>Si todavía no existe una aplicación funcional, crea la configuración mínima</w:t>
+      </w:r>
+    </w:p>
+    <w:p>
+      <w:r>
+        <w:t>necesaria.</w:t>
+      </w:r>
+    </w:p>
+    <w:p/>
+    <w:p>
+      <w:r>
+        <w:t>NO introduzcas frameworks adicionales salvo que sean realmente necesarios.</w:t>
+      </w:r>
+    </w:p>
+    <w:p/>
+    <w:p>
+      <w:r>
+        <w:t>==================================================</w:t>
+      </w:r>
+    </w:p>
+    <w:p>
+      <w:r>
+        <w:t>PRIMERA PANTALLA</w:t>
+      </w:r>
+    </w:p>
+    <w:p>
+      <w:r>
+        <w:t>==================================================</w:t>
+      </w:r>
+    </w:p>
+    <w:p/>
+    <w:p>
+      <w:r>
+        <w:lastRenderedPageBreak/>
+        <w:t>Construye una pantalla inicial de:</w:t>
+      </w:r>
+    </w:p>
+    <w:p/>
+    <w:p>
+      <w:r>
+        <w:t>"Plan Nutricional"</w:t>
+      </w:r>
+    </w:p>
+    <w:p/>
+    <w:p>
+      <w:r>
+        <w:t>La pantalla debe permitir visualizar un paciente existente.</w:t>
+      </w:r>
+    </w:p>
+    <w:p/>
+    <w:p>
+      <w:r>
+        <w:t>No necesitamos autenticación todavía.</w:t>
+      </w:r>
+    </w:p>
+    <w:p/>
+    <w:p>
+      <w:r>
+        <w:t>Para esta primera versión puede utilizarse un paciente existente mediante</w:t>
+      </w:r>
+    </w:p>
+    <w:p>
+      <w:r>
+        <w:t>ID configurable/simple.</w:t>
+      </w:r>
+    </w:p>
+    <w:p/>
+    <w:p>
+      <w:r>
+        <w:t>La pantalla debe mostrar:</w:t>
+      </w:r>
+    </w:p>
+    <w:p/>
+    <w:p>
+      <w:r>
+        <w:t>--------------------------------</w:t>
+      </w:r>
+    </w:p>
+    <w:p>
+      <w:r>
+        <w:t>PLAN NUTRICIONAL</w:t>
+      </w:r>
+    </w:p>
+    <w:p>
+      <w:r>
+        <w:t>Paciente: [Nombre]</w:t>
+      </w:r>
+    </w:p>
+    <w:p/>
+    <w:p>
+      <w:r>
+        <w:t>Objetivo:</w:t>
+      </w:r>
+    </w:p>
+    <w:p>
+      <w:r>
+        <w:t>[Perder peso / Mantener / Ganar peso]</w:t>
+      </w:r>
+    </w:p>
+    <w:p/>
+    <w:p>
+      <w:r>
+        <w:t>Calorías objetivo: XXXX kcal</w:t>
+      </w:r>
+    </w:p>
+    <w:p>
+      <w:r>
+        <w:t>Proteínas: XX g</w:t>
+      </w:r>
+    </w:p>
+    <w:p>
+      <w:r>
+        <w:t>Carbohidratos: XX g</w:t>
+      </w:r>
+    </w:p>
+    <w:p>
+      <w:r>
+        <w:t>Grasas: XX g</w:t>
+      </w:r>
+    </w:p>
+    <w:p/>
+    <w:p>
+      <w:r>
+        <w:t>--------------------------------</w:t>
+      </w:r>
+    </w:p>
+    <w:p/>
+    <w:p>
+      <w:r>
+        <w:t>DÍAS DEL PLAN</w:t>
+      </w:r>
+    </w:p>
+    <w:p/>
+    <w:p>
+      <w:r>
+        <w:t>[ Día 1 ] [ Día 2 ] [ Día 3 ] ... [ Día 14 ]</w:t>
+      </w:r>
+    </w:p>
+    <w:p/>
+    <w:p>
+      <w:r>
+        <w:t>--------------------------------</w:t>
+      </w:r>
+    </w:p>
+    <w:p/>
+    <w:p>
+      <w:r>
+        <w:t>DÍA 1</w:t>
+      </w:r>
+    </w:p>
+    <w:p/>
+    <w:p>
+      <w:r>
+        <w:t>DESAYUNO</w:t>
+      </w:r>
+    </w:p>
+    <w:p>
+      <w:r>
+        <w:t>- alimento</w:t>
+      </w:r>
+    </w:p>
+    <w:p>
+      <w:r>
+        <w:t>- cantidad</w:t>
+      </w:r>
+    </w:p>
+    <w:p>
+      <w:r>
+        <w:t>- calorías</w:t>
+      </w:r>
+    </w:p>
+    <w:p>
+      <w:r>
+        <w:t>- macros</w:t>
+      </w:r>
+    </w:p>
+    <w:p/>
+    <w:p>
+      <w:r>
+        <w:t>COMIDA</w:t>
+      </w:r>
+    </w:p>
+    <w:p>
+      <w:r>
+        <w:t>- alimento</w:t>
+      </w:r>
+    </w:p>
+    <w:p>
+      <w:r>
+        <w:t>- cantidad</w:t>
+      </w:r>
+    </w:p>
+    <w:p>
+      <w:r>
+        <w:t>- calorías</w:t>
+      </w:r>
+    </w:p>
+    <w:p>
+      <w:r>
+        <w:t>- macros</w:t>
+      </w:r>
+    </w:p>
+    <w:p/>
+    <w:p>
+      <w:r>
+        <w:t>CENA</w:t>
+      </w:r>
+    </w:p>
+    <w:p>
+      <w:r>
+        <w:t>- alimento</w:t>
+      </w:r>
+    </w:p>
+    <w:p>
+      <w:r>
+        <w:t>- cantidad</w:t>
+      </w:r>
+    </w:p>
+    <w:p>
+      <w:r>
+        <w:t>- calorías</w:t>
+      </w:r>
+    </w:p>
+    <w:p>
+      <w:r>
+        <w:t>- macros</w:t>
+      </w:r>
+    </w:p>
+    <w:p/>
+    <w:p>
+      <w:r>
+        <w:t>TOTAL DEL DÍA</w:t>
+      </w:r>
+    </w:p>
+    <w:p>
+      <w:r>
+        <w:t>XXXX kcal</w:t>
+      </w:r>
+    </w:p>
+    <w:p>
+      <w:r>
+        <w:t>XX g proteína</w:t>
+      </w:r>
+    </w:p>
+    <w:p>
+      <w:r>
+        <w:t>XX g carbohidratos</w:t>
+      </w:r>
+    </w:p>
+    <w:p>
+      <w:r>
+        <w:t>XX g grasa</w:t>
+      </w:r>
+    </w:p>
+    <w:p/>
+    <w:p>
+      <w:r>
+        <w:t>--------------------------------</w:t>
+      </w:r>
+    </w:p>
+    <w:p/>
+    <w:p>
+      <w:r>
+        <w:t>La interfaz debe permitir cambiar entre los 14 días.</w:t>
+      </w:r>
+    </w:p>
+    <w:p/>
+    <w:p>
+      <w:r>
+        <w:t>==================================================</w:t>
+      </w:r>
+    </w:p>
+    <w:p>
+      <w:r>
+        <w:t>DISEÑO</w:t>
+      </w:r>
+    </w:p>
+    <w:p>
+      <w:r>
+        <w:t>==================================================</w:t>
+      </w:r>
+    </w:p>
+    <w:p/>
+    <w:p>
+      <w:r>
+        <w:t>No necesito todavía un diseño visual definitivo.</w:t>
+      </w:r>
+    </w:p>
+    <w:p/>
+    <w:p>
+      <w:r>
+        <w:t>Quiero:</w:t>
+      </w:r>
+    </w:p>
+    <w:p/>
+    <w:p>
+      <w:r>
+        <w:t>- interfaz limpia</w:t>
+      </w:r>
+    </w:p>
+    <w:p>
+      <w:r>
+        <w:t>- legible</w:t>
+      </w:r>
+    </w:p>
+    <w:p>
+      <w:r>
+        <w:t>- responsive básico</w:t>
+      </w:r>
+    </w:p>
+    <w:p>
+      <w:r>
+        <w:t>- buena jerarquía visual</w:t>
+      </w:r>
+    </w:p>
+    <w:p>
+      <w:r>
+        <w:t>- componentes simples</w:t>
+      </w:r>
+    </w:p>
+    <w:p>
+      <w:r>
+        <w:t>- nada de diseño enterprise</w:t>
+      </w:r>
+    </w:p>
+    <w:p>
+      <w:r>
+        <w:t>- nada de animaciones innecesarias</w:t>
+      </w:r>
+    </w:p>
+    <w:p/>
+    <w:p>
+      <w:r>
+        <w:t>El objetivo es poder abrir localhost y empezar a visualizar el producto.</w:t>
+      </w:r>
+    </w:p>
+    <w:p/>
+    <w:p>
+      <w:r>
+        <w:t>NO dediques la mayor parte del tiempo a diseño visual.</w:t>
+      </w:r>
+    </w:p>
+    <w:p/>
+    <w:p>
+      <w:r>
+        <w:t>Prioriza:</w:t>
+      </w:r>
+    </w:p>
+    <w:p/>
+    <w:p>
+      <w:r>
+        <w:t>FUNCIONALIDAD &gt; CLARIDAD &gt; ESTÉTICA</w:t>
+      </w:r>
+    </w:p>
+    <w:p/>
+    <w:p>
+      <w:r>
+        <w:t>==================================================</w:t>
+      </w:r>
+    </w:p>
+    <w:p>
+      <w:r>
+        <w:t>PARTE 4 — INTEGRACIÓN</w:t>
+      </w:r>
+    </w:p>
+    <w:p>
+      <w:r>
+        <w:t>==================================================</w:t>
+      </w:r>
+    </w:p>
+    <w:p/>
+    <w:p>
+      <w:r>
+        <w:t>Conecta React con el endpoint real de FastAPI.</w:t>
+      </w:r>
+    </w:p>
+    <w:p/>
+    <w:p>
+      <w:r>
+        <w:t>NO utilices datos falsos si el backend ya puede proporcionar los datos reales.</w:t>
+      </w:r>
+    </w:p>
+    <w:p/>
+    <w:p>
+      <w:r>
+        <w:t>El flujo debe ser:</w:t>
+      </w:r>
+    </w:p>
+    <w:p/>
+    <w:p>
+      <w:r>
+        <w:t>React</w:t>
+      </w:r>
+    </w:p>
+    <w:p>
+      <w:r>
+        <w:t xml:space="preserve"> ↓</w:t>
+      </w:r>
+    </w:p>
+    <w:p>
+      <w:r>
+        <w:t>FastAPI</w:t>
+      </w:r>
+    </w:p>
+    <w:p>
+      <w:r>
+        <w:t xml:space="preserve"> ↓</w:t>
+      </w:r>
+    </w:p>
     <w:p>
       <w:r>
         <w:t>Patient</w:t>
@@ -261,565 +1076,475 @@
     </w:p>
     <w:p>
       <w:r>
-        <w:t>→ BMR</w:t>
-      </w:r>
-    </w:p>
-    <w:p>
-      <w:r>
-        <w:t>→ TDEE</w:t>
-      </w:r>
-    </w:p>
-    <w:p>
-      <w:r>
-        <w:t>→ Nutrition Target</w:t>
-      </w:r>
-    </w:p>
-    <w:p>
-      <w:r>
-        <w:t>→ Macronutrients</w:t>
-      </w:r>
-    </w:p>
-    <w:p/>
-    <w:p>
-      <w:r>
-        <w:t>No rompas ninguna funcionalidad existente.</w:t>
-      </w:r>
-    </w:p>
-    <w:p/>
-    <w:p>
-      <w:r>
-        <w:t>2. MODELO MÍNIMO</w:t>
-      </w:r>
-    </w:p>
-    <w:p/>
-    <w:p>
-      <w:r>
-        <w:t>Define únicamente los conceptos necesarios para representar:</w:t>
-      </w:r>
-    </w:p>
-    <w:p/>
-    <w:p>
-      <w:r>
-        <w:t>FOOD</w:t>
-      </w:r>
-    </w:p>
-    <w:p>
-      <w:r>
-        <w:t>- nombre</w:t>
+        <w:t xml:space="preserve"> ↓</w:t>
+      </w:r>
+    </w:p>
+    <w:p>
+      <w:r>
+        <w:t>Nutrition Target</w:t>
       </w:r>
     </w:p>
     <w:p>
       <w:r>
         <w:lastRenderedPageBreak/>
-        <w:t>- calorías</w:t>
-      </w:r>
-    </w:p>
-    <w:p>
-      <w:r>
-        <w:t>- proteínas</w:t>
-      </w:r>
-    </w:p>
-    <w:p>
-      <w:r>
-        <w:t>- carbohidratos</w:t>
-      </w:r>
-    </w:p>
-    <w:p>
-      <w:r>
-        <w:t>- grasas</w:t>
-      </w:r>
-    </w:p>
-    <w:p/>
-    <w:p>
-      <w:r>
-        <w:t>MEAL</w:t>
-      </w:r>
-    </w:p>
-    <w:p>
-      <w:r>
-        <w:t>- nombre</w:t>
-      </w:r>
-    </w:p>
-    <w:p>
-      <w:r>
-        <w:t>- alimentos</w:t>
-      </w:r>
-    </w:p>
-    <w:p>
-      <w:r>
-        <w:t>- cantidades</w:t>
-      </w:r>
-    </w:p>
-    <w:p/>
-    <w:p>
-      <w:r>
-        <w:t>DAILY DIET</w:t>
-      </w:r>
-    </w:p>
-    <w:p>
-      <w:r>
-        <w:t>- fecha o identificador del día</w:t>
-      </w:r>
-    </w:p>
-    <w:p>
-      <w:r>
-        <w:t>- comidas</w:t>
-      </w:r>
-    </w:p>
-    <w:p>
-      <w:r>
-        <w:t>- totales nutricionales</w:t>
-      </w:r>
-    </w:p>
-    <w:p/>
-    <w:p>
-      <w:r>
-        <w:t>No crear todavía una base de datos completa de alimentos.</w:t>
-      </w:r>
-    </w:p>
-    <w:p/>
-    <w:p>
-      <w:r>
-        <w:t>Para esta primera iteración puedes utilizar un pequeño catálogo inicial</w:t>
-      </w:r>
-    </w:p>
-    <w:p>
-      <w:r>
-        <w:t>de alimentos claramente definido si es necesario para demostrar el flujo.</w:t>
-      </w:r>
-    </w:p>
-    <w:p/>
-    <w:p>
-      <w:r>
-        <w:t>El catálogo debe ser pequeño y explícito.</w:t>
-      </w:r>
-    </w:p>
-    <w:p/>
-    <w:p>
-      <w:r>
-        <w:t>NO crear cientos de alimentos.</w:t>
-      </w:r>
-    </w:p>
-    <w:p/>
-    <w:p>
-      <w:r>
-        <w:t>3. GENERADOR</w:t>
-      </w:r>
-    </w:p>
-    <w:p/>
+        <w:t xml:space="preserve"> ↓</w:t>
+      </w:r>
+    </w:p>
+    <w:p>
+      <w:r>
+        <w:t>14-Day Diet Generator</w:t>
+      </w:r>
+    </w:p>
+    <w:p>
+      <w:r>
+        <w:t xml:space="preserve"> ↓</w:t>
+      </w:r>
+    </w:p>
+    <w:p>
+      <w:r>
+        <w:t>JSON</w:t>
+      </w:r>
+    </w:p>
+    <w:p>
+      <w:r>
+        <w:t xml:space="preserve"> ↓</w:t>
+      </w:r>
+    </w:p>
+    <w:p>
+      <w:r>
+        <w:t>React</w:t>
+      </w:r>
+    </w:p>
+    <w:p>
+      <w:r>
+        <w:t xml:space="preserve"> ↓</w:t>
+      </w:r>
+    </w:p>
+    <w:p>
+      <w:r>
+        <w:t>Visualización</w:t>
+      </w:r>
+    </w:p>
+    <w:p/>
+    <w:p>
+      <w:r>
+        <w:t>Configura únicamente lo necesario para que frontend y backend puedan</w:t>
+      </w:r>
+    </w:p>
+    <w:p>
+      <w:r>
+        <w:t>comunicarse correctamente en localhost.</w:t>
+      </w:r>
+    </w:p>
+    <w:p/>
+    <w:p>
+      <w:r>
+        <w:t>Si aparece un problema de CORS, resuélvelo de la manera mínima necesaria.</w:t>
+      </w:r>
+    </w:p>
+    <w:p/>
+    <w:p>
+      <w:r>
+        <w:t>==================================================</w:t>
+      </w:r>
+    </w:p>
+    <w:p>
+      <w:r>
+        <w:t>PARTE 5 — TESTS</w:t>
+      </w:r>
+    </w:p>
+    <w:p>
+      <w:r>
+        <w:t>==================================================</w:t>
+      </w:r>
+    </w:p>
+    <w:p/>
+    <w:p>
+      <w:r>
+        <w:t>Backend:</w:t>
+      </w:r>
+    </w:p>
+    <w:p/>
+    <w:p>
+      <w:r>
+        <w:t>Añade tests para comprobar:</w:t>
+      </w:r>
+    </w:p>
+    <w:p/>
+    <w:p>
+      <w:r>
+        <w:t>- generación de 14 días</w:t>
+      </w:r>
+    </w:p>
+    <w:p>
+      <w:r>
+        <w:t>- exactamente 14 días</w:t>
+      </w:r>
+    </w:p>
+    <w:p>
+      <w:r>
+        <w:t>- cada día contiene las comidas esperadas</w:t>
+      </w:r>
+    </w:p>
+    <w:p>
+      <w:r>
+        <w:t>- cada día contiene alimentos</w:t>
+      </w:r>
+    </w:p>
     <w:p>
       <w:r>
         <w:lastRenderedPageBreak/>
-        <w:t>Crea una lógica independiente de FastAPI que reciba:</w:t>
-      </w:r>
-    </w:p>
-    <w:p/>
-    <w:p>
-      <w:r>
-        <w:t>- objetivo calórico</w:t>
-      </w:r>
-    </w:p>
-    <w:p>
-      <w:r>
-        <w:t>- objetivo de proteínas</w:t>
-      </w:r>
-    </w:p>
-    <w:p>
-      <w:r>
-        <w:t>- objetivo de carbohidratos</w:t>
-      </w:r>
-    </w:p>
-    <w:p>
-      <w:r>
-        <w:t>- objetivo de grasas</w:t>
-      </w:r>
-    </w:p>
-    <w:p/>
-    <w:p>
-      <w:r>
-        <w:t>y genere una dieta diaria compuesta por:</w:t>
-      </w:r>
-    </w:p>
-    <w:p/>
-    <w:p>
-      <w:r>
-        <w:t>- desayuno</w:t>
-      </w:r>
-    </w:p>
-    <w:p>
-      <w:r>
-        <w:t>- comida</w:t>
-      </w:r>
-    </w:p>
-    <w:p>
-      <w:r>
-        <w:t>- cena</w:t>
-      </w:r>
-    </w:p>
-    <w:p>
-      <w:r>
-        <w:t>- opcionalmente un snack si resulta necesario</w:t>
-      </w:r>
-    </w:p>
-    <w:p/>
-    <w:p>
-      <w:r>
-        <w:t>El generador debe intentar acercarse al objetivo nutricional.</w:t>
-      </w:r>
-    </w:p>
-    <w:p/>
-    <w:p>
-      <w:r>
-        <w:t>No necesita ser perfecto todavía.</w:t>
-      </w:r>
-    </w:p>
-    <w:p/>
-    <w:p>
-      <w:r>
-        <w:t>Lo importante es que:</w:t>
-      </w:r>
-    </w:p>
-    <w:p/>
-    <w:p>
-      <w:r>
-        <w:t>- las cantidades sean explícitas</w:t>
-      </w:r>
-    </w:p>
-    <w:p>
-      <w:r>
-        <w:t>- los cálculos sean reproducibles</w:t>
-      </w:r>
-    </w:p>
-    <w:p>
-      <w:r>
-        <w:t>- los totales puedan verificarse</w:t>
-      </w:r>
-    </w:p>
-    <w:p>
-      <w:r>
-        <w:t>- no existan decisiones aleatorias ocultas</w:t>
-      </w:r>
-    </w:p>
-    <w:p/>
-    <w:p>
-      <w:r>
-        <w:t>Si existe una desviación respecto al objetivo, devuélvela claramente.</w:t>
-      </w:r>
-    </w:p>
-    <w:p/>
-    <w:p>
-      <w:r>
-        <w:t>NO inventes un algoritmo de optimización complejo.</w:t>
-      </w:r>
-    </w:p>
-    <w:p/>
-    <w:p>
-      <w:r>
-        <w:t>Utiliza la solución más sencilla que produzca una primera dieta coherente.</w:t>
-      </w:r>
-    </w:p>
-    <w:p/>
-    <w:p>
-      <w:r>
-        <w:t>4. SEPARACIÓN</w:t>
-      </w:r>
-    </w:p>
-    <w:p/>
-    <w:p>
-      <w:r>
-        <w:t>Mantén la lógica del generador independiente de:</w:t>
-      </w:r>
-    </w:p>
-    <w:p/>
-    <w:p>
-      <w:r>
-        <w:t>- FastAPI</w:t>
-      </w:r>
-    </w:p>
-    <w:p>
-      <w:r>
-        <w:t>- PostgreSQL</w:t>
-      </w:r>
-    </w:p>
-    <w:p>
-      <w:r>
-        <w:t>- HTTP</w:t>
-      </w:r>
-    </w:p>
-    <w:p>
-      <w:r>
-        <w:t>- routers</w:t>
-      </w:r>
-    </w:p>
-    <w:p/>
-    <w:p>
-      <w:r>
-        <w:t>La arquitectura conceptual debe ser:</w:t>
-      </w:r>
-    </w:p>
-    <w:p/>
-    <w:p>
-      <w:r>
-        <w:t>Nutrition Target</w:t>
-      </w:r>
-    </w:p>
-    <w:p>
-      <w:r>
-        <w:t xml:space="preserve">       ↓</w:t>
-      </w:r>
-    </w:p>
-    <w:p>
-      <w:r>
-        <w:t>Diet Generator</w:t>
-      </w:r>
-    </w:p>
-    <w:p>
-      <w:r>
-        <w:t xml:space="preserve">       ↓</w:t>
-      </w:r>
-    </w:p>
-    <w:p>
-      <w:r>
-        <w:t>Daily Diet</w:t>
-      </w:r>
-    </w:p>
-    <w:p/>
-    <w:p>
-      <w:r>
-        <w:t>5. API</w:t>
-      </w:r>
-    </w:p>
-    <w:p/>
-    <w:p>
-      <w:r>
-        <w:t>Añade un endpoint mínimo para generar una dieta diaria para un paciente.</w:t>
-      </w:r>
-    </w:p>
-    <w:p/>
+        <w:t>- totales calculados correctamente</w:t>
+      </w:r>
+    </w:p>
+    <w:p>
+      <w:r>
+        <w:t>- variación entre días</w:t>
+      </w:r>
+    </w:p>
+    <w:p>
+      <w:r>
+        <w:t>- objetivo válido</w:t>
+      </w:r>
+    </w:p>
+    <w:p>
+      <w:r>
+        <w:t>- paciente inexistente</w:t>
+      </w:r>
+    </w:p>
+    <w:p/>
+    <w:p>
+      <w:r>
+        <w:t>Mantén TODOS los tests anteriores funcionando.</w:t>
+      </w:r>
+    </w:p>
+    <w:p/>
+    <w:p>
+      <w:r>
+        <w:t>Frontend:</w:t>
+      </w:r>
+    </w:p>
+    <w:p/>
+    <w:p>
+      <w:r>
+        <w:t>Si existe infraestructura de testing, añade únicamente pruebas mínimas</w:t>
+      </w:r>
+    </w:p>
+    <w:p>
+      <w:r>
+        <w:t>útiles.</w:t>
+      </w:r>
+    </w:p>
+    <w:p/>
+    <w:p>
+      <w:r>
+        <w:t>NO construyas un sistema de testing complejo.</w:t>
+      </w:r>
+    </w:p>
+    <w:p/>
+    <w:p>
+      <w:r>
+        <w:t>==================================================</w:t>
+      </w:r>
+    </w:p>
+    <w:p>
+      <w:r>
+        <w:t>PARTE 6 — DOCUMENTACIÓN</w:t>
+      </w:r>
+    </w:p>
+    <w:p>
+      <w:r>
+        <w:t>==================================================</w:t>
+      </w:r>
+    </w:p>
+    <w:p/>
+    <w:p>
+      <w:r>
+        <w:t>Actualiza `PROJECT.md` solamente con decisiones importantes y estables.</w:t>
+      </w:r>
+    </w:p>
+    <w:p/>
+    <w:p>
+      <w:r>
+        <w:t>Actualiza `README.md` con:</w:t>
+      </w:r>
+    </w:p>
+    <w:p/>
+    <w:p>
+      <w:r>
+        <w:t>- cómo iniciar backend</w:t>
+      </w:r>
+    </w:p>
+    <w:p>
+      <w:r>
+        <w:t>- cómo iniciar frontend</w:t>
+      </w:r>
+    </w:p>
+    <w:p>
+      <w:r>
+        <w:t>- URL local del frontend</w:t>
+      </w:r>
+    </w:p>
+    <w:p>
+      <w:r>
+        <w:t>- URL local del backend</w:t>
+      </w:r>
+    </w:p>
     <w:p>
       <w:r>
         <w:lastRenderedPageBreak/>
-        <w:t>Ejemplo:</w:t>
-      </w:r>
-    </w:p>
-    <w:p/>
-    <w:p>
-      <w:r>
-        <w:t>GET /patients/{id}/diet</w:t>
-      </w:r>
-    </w:p>
-    <w:p/>
-    <w:p>
-      <w:r>
-        <w:t>Debe:</w:t>
-      </w:r>
-    </w:p>
-    <w:p/>
-    <w:p>
-      <w:r>
-        <w:t>1. obtener el paciente</w:t>
-      </w:r>
-    </w:p>
-    <w:p>
-      <w:r>
-        <w:t>2. calcular su Nutrition Target</w:t>
-      </w:r>
-    </w:p>
-    <w:p>
-      <w:r>
-        <w:t>3. generar una dieta diaria</w:t>
-      </w:r>
-    </w:p>
-    <w:p>
-      <w:r>
-        <w:t>4. devolver la dieta y sus totales</w:t>
-      </w:r>
-    </w:p>
-    <w:p/>
-    <w:p>
-      <w:r>
-        <w:t>No persistir todavía la dieta.</w:t>
-      </w:r>
-    </w:p>
-    <w:p/>
-    <w:p>
-      <w:r>
-        <w:t>Cada solicitud puede generar el resultado bajo demanda.</w:t>
-      </w:r>
-    </w:p>
-    <w:p/>
-    <w:p>
-      <w:r>
-        <w:t>6. RESPUESTA</w:t>
-      </w:r>
-    </w:p>
-    <w:p/>
-    <w:p>
-      <w:r>
-        <w:t>La respuesta debe permitir comprobar claramente:</w:t>
-      </w:r>
-    </w:p>
-    <w:p/>
-    <w:p>
-      <w:r>
-        <w:t>- comidas</w:t>
-      </w:r>
-    </w:p>
-    <w:p>
-      <w:r>
-        <w:t>- alimentos</w:t>
-      </w:r>
-    </w:p>
-    <w:p>
-      <w:r>
-        <w:t>- cantidades</w:t>
-      </w:r>
-    </w:p>
-    <w:p>
-      <w:r>
-        <w:t>- calorías por alimento/comida</w:t>
-      </w:r>
-    </w:p>
-    <w:p>
-      <w:r>
-        <w:t>- proteínas</w:t>
-      </w:r>
-    </w:p>
-    <w:p>
-      <w:r>
-        <w:t>- carbohidratos</w:t>
-      </w:r>
-    </w:p>
-    <w:p>
-      <w:r>
-        <w:t>- grasas</w:t>
+        <w:t>- cómo comprobar el plan de 14 días</w:t>
+      </w:r>
+    </w:p>
+    <w:p/>
+    <w:p>
+      <w:r>
+        <w:t>No crear documentación enorme.</w:t>
+      </w:r>
+    </w:p>
+    <w:p/>
+    <w:p>
+      <w:r>
+        <w:t>==================================================</w:t>
+      </w:r>
+    </w:p>
+    <w:p>
+      <w:r>
+        <w:t>LÍMITES</w:t>
+      </w:r>
+    </w:p>
+    <w:p>
+      <w:r>
+        <w:t>==================================================</w:t>
+      </w:r>
+    </w:p>
+    <w:p/>
+    <w:p>
+      <w:r>
+        <w:t>NO implementar todavía:</w:t>
+      </w:r>
+    </w:p>
+    <w:p/>
+    <w:p>
+      <w:r>
+        <w:t>- autenticación</w:t>
+      </w:r>
+    </w:p>
+    <w:p>
+      <w:r>
+        <w:t>- registro/login</w:t>
+      </w:r>
+    </w:p>
+    <w:p>
+      <w:r>
+        <w:t>- roles</w:t>
+      </w:r>
+    </w:p>
+    <w:p>
+      <w:r>
+        <w:t>- dashboard completo</w:t>
+      </w:r>
+    </w:p>
+    <w:p>
+      <w:r>
+        <w:t>- nutriólogo</w:t>
+      </w:r>
+    </w:p>
+    <w:p>
+      <w:r>
+        <w:t>- diagnóstico clínico</w:t>
+      </w:r>
+    </w:p>
+    <w:p>
+      <w:r>
+        <w:t>- enfermedades</w:t>
+      </w:r>
+    </w:p>
+    <w:p>
+      <w:r>
+        <w:t>- IA</w:t>
+      </w:r>
+    </w:p>
+    <w:p>
+      <w:r>
+        <w:t>- chatbot</w:t>
+      </w:r>
+    </w:p>
+    <w:p>
+      <w:r>
+        <w:t>- recetas avanzadas</w:t>
+      </w:r>
+    </w:p>
+    <w:p>
+      <w:r>
+        <w:t>- supermercado</w:t>
+      </w:r>
+    </w:p>
+    <w:p>
+      <w:r>
+        <w:t>- geolocalización</w:t>
+      </w:r>
+    </w:p>
+    <w:p>
+      <w:r>
+        <w:t>- Excel</w:t>
+      </w:r>
+    </w:p>
+    <w:p>
+      <w:r>
+        <w:t>- pagos</w:t>
+      </w:r>
+    </w:p>
+    <w:p>
+      <w:r>
+        <w:t>- integraciones externas</w:t>
+      </w:r>
+    </w:p>
+    <w:p>
+      <w:r>
+        <w:t>- aplicación móvil React Native</w:t>
       </w:r>
     </w:p>
     <w:p>
       <w:r>
         <w:lastRenderedPageBreak/>
-        <w:t>- totales diarios</w:t>
-      </w:r>
-    </w:p>
-    <w:p>
-      <w:r>
-        <w:t>- objetivo diario</w:t>
-      </w:r>
-    </w:p>
-    <w:p>
-      <w:r>
-        <w:t>- diferencia entre objetivo y resultado</w:t>
-      </w:r>
-    </w:p>
-    <w:p/>
-    <w:p>
-      <w:r>
-        <w:t>No devolver una estructura innecesariamente compleja.</w:t>
-      </w:r>
-    </w:p>
-    <w:p/>
-    <w:p>
-      <w:r>
-        <w:t>7. TESTS</w:t>
-      </w:r>
-    </w:p>
-    <w:p/>
-    <w:p>
-      <w:r>
-        <w:t>Crea tests para comprobar:</w:t>
-      </w:r>
-    </w:p>
-    <w:p/>
-    <w:p>
-      <w:r>
-        <w:t>- generación de dieta válida</w:t>
-      </w:r>
-    </w:p>
-    <w:p>
-      <w:r>
-        <w:t>- existencia de comidas</w:t>
-      </w:r>
-    </w:p>
-    <w:p>
-      <w:r>
-        <w:t>- alimentos con cantidades</w:t>
-      </w:r>
-    </w:p>
-    <w:p>
-      <w:r>
-        <w:t>- cálculo correcto de totales</w:t>
-      </w:r>
-    </w:p>
-    <w:p>
-      <w:r>
-        <w:t>- comparación contra objetivo</w:t>
-      </w:r>
-    </w:p>
-    <w:p>
-      <w:r>
-        <w:t>- comportamiento cuando no se puede alcanzar exactamente el objetivo</w:t>
-      </w:r>
-    </w:p>
-    <w:p>
-      <w:r>
-        <w:t>- paciente inexistente</w:t>
-      </w:r>
-    </w:p>
-    <w:p>
-      <w:r>
-        <w:t>- objetivos inválidos</w:t>
-      </w:r>
-    </w:p>
-    <w:p/>
-    <w:p>
-      <w:r>
-        <w:t>Los tests deben ser deterministas.</w:t>
-      </w:r>
-    </w:p>
-    <w:p/>
-    <w:p>
-      <w:r>
-        <w:t>Mantén TODOS los tests anteriores funcionando.</w:t>
-      </w:r>
-    </w:p>
-    <w:p/>
-    <w:p>
-      <w:r>
-        <w:t>8. DOCUMENTACIÓN</w:t>
-      </w:r>
-    </w:p>
-    <w:p/>
-    <w:p>
-      <w:r>
-        <w:t>Actualiza `PROJECT.md` únicamente para registrar decisiones estables:</w:t>
-      </w:r>
-    </w:p>
-    <w:p/>
-    <w:p>
-      <w:r>
-        <w:t>- estructura de Food / Meal / Daily Diet</w:t>
-      </w:r>
-    </w:p>
-    <w:p>
-      <w:r>
-        <w:t>- estrategia básica utilizada por el generador</w:t>
-      </w:r>
-    </w:p>
-    <w:p>
-      <w:r>
-        <w:t>- limitaciones actuales</w:t>
-      </w:r>
-    </w:p>
-    <w:p/>
-    <w:p>
-      <w:r>
-        <w:t>No convertir el documento en una especificación gigantesca.</w:t>
-      </w:r>
-    </w:p>
-    <w:p/>
-    <w:p>
-      <w:r>
-        <w:t>9. VERIFICACIÓN</w:t>
+        <w:t>- persistencia de planes</w:t>
+      </w:r>
+    </w:p>
+    <w:p>
+      <w:r>
+        <w:t>- calendario avanzado</w:t>
+      </w:r>
+    </w:p>
+    <w:p>
+      <w:r>
+        <w:t>- sistema de recomendaciones</w:t>
+      </w:r>
+    </w:p>
+    <w:p>
+      <w:r>
+        <w:t>- arquitectura enterprise</w:t>
+      </w:r>
+    </w:p>
+    <w:p>
+      <w:r>
+        <w:t>- microservicios</w:t>
+      </w:r>
+    </w:p>
+    <w:p>
+      <w:r>
+        <w:t>- Docker si no es necesario</w:t>
+      </w:r>
+    </w:p>
+    <w:p/>
+    <w:p>
+      <w:r>
+        <w:t>NO conviertas este prompt en una excusa para construir todo el producto.</w:t>
+      </w:r>
+    </w:p>
+    <w:p/>
+    <w:p>
+      <w:r>
+        <w:t>==================================================</w:t>
+      </w:r>
+    </w:p>
+    <w:p>
+      <w:r>
+        <w:t>PRINCIPIO</w:t>
+      </w:r>
+    </w:p>
+    <w:p>
+      <w:r>
+        <w:t>==================================================</w:t>
+      </w:r>
+    </w:p>
+    <w:p/>
+    <w:p>
+      <w:r>
+        <w:t>Hasta ahora hemos construido el motor.</w:t>
+      </w:r>
+    </w:p>
+    <w:p/>
+    <w:p>
+      <w:r>
+        <w:t>Ahora quiero una primera ventana al producto.</w:t>
+      </w:r>
+    </w:p>
+    <w:p/>
+    <w:p>
+      <w:r>
+        <w:t>La prioridad de esta iteración es:</w:t>
+      </w:r>
+    </w:p>
+    <w:p/>
+    <w:p>
+      <w:r>
+        <w:t>BACKEND FUNCIONAL</w:t>
+      </w:r>
+    </w:p>
+    <w:p>
+      <w:r>
+        <w:t>+</w:t>
+      </w:r>
+    </w:p>
+    <w:p>
+      <w:r>
+        <w:t>PLAN DE 14 DÍAS</w:t>
+      </w:r>
+    </w:p>
+    <w:p>
+      <w:r>
+        <w:t>+</w:t>
+      </w:r>
+    </w:p>
+    <w:p>
+      <w:r>
+        <w:t>PRIMERA UI REAL EN LOCALHOST</w:t>
+      </w:r>
+    </w:p>
+    <w:p/>
+    <w:p>
+      <w:r>
+        <w:t>Quiero poder ejecutar el proyecto y VER cómo comienza a verse el sistema.</w:t>
+      </w:r>
+    </w:p>
+    <w:p/>
+    <w:p>
+      <w:r>
+        <w:t>Si encuentras problemas arquitectónicos, no rehagas todo.</w:t>
+      </w:r>
+    </w:p>
+    <w:p/>
+    <w:p>
+      <w:r>
+        <w:t>Haz la modificación mínima necesaria y continúa.</w:t>
+      </w:r>
+    </w:p>
+    <w:p/>
+    <w:p>
+      <w:r>
+        <w:t>Si alguna decisión importante no puede resolverse sin cambiar la visión</w:t>
+      </w:r>
+    </w:p>
+    <w:p>
+      <w:r>
+        <w:t>del producto, detente y señálala en lugar de inventar una solución.</w:t>
+      </w:r>
+    </w:p>
+    <w:p/>
+    <w:p>
+      <w:r>
+        <w:t>==================================================</w:t>
+      </w:r>
+    </w:p>
+    <w:p>
+      <w:r>
+        <w:t>VERIFICACIÓN FINAL</w:t>
+      </w:r>
+    </w:p>
+    <w:p>
+      <w:r>
+        <w:t>==================================================</w:t>
       </w:r>
     </w:p>
     <w:p/>
@@ -831,12 +1556,12 @@
     <w:p/>
     <w:p>
       <w:r>
-        <w:t>- FastAPI inicia.</w:t>
-      </w:r>
-    </w:p>
-    <w:p>
-      <w:r>
-        <w:t>- `/` funciona.</w:t>
+        <w:t>- Backend inicia.</w:t>
+      </w:r>
+    </w:p>
+    <w:p>
+      <w:r>
+        <w:t>- PostgreSQL funciona.</w:t>
       </w:r>
     </w:p>
     <w:p>
@@ -866,32 +1591,63 @@
     </w:p>
     <w:p>
       <w:r>
-        <w:t>- La dieta contiene cantidades y valores nutricionales.</w:t>
-      </w:r>
-    </w:p>
-    <w:p>
-      <w:r>
-        <w:t>- Los totales se calculan correctamente.</w:t>
-      </w:r>
-    </w:p>
-    <w:p>
-      <w:r>
-        <w:t>- Los tests anteriores continúan pasando.</w:t>
-      </w:r>
-    </w:p>
-    <w:p>
-      <w:r>
+        <w:t>- `/patients/{id}/diet-plan` funciona.</w:t>
+      </w:r>
+    </w:p>
+    <w:p>
+      <w:r>
+        <w:t>- El plan contiene exactamente 14 días.</w:t>
+      </w:r>
+    </w:p>
+    <w:p>
+      <w:r>
+        <w:t>- Los días contienen comidas y alimentos.</w:t>
+      </w:r>
+    </w:p>
+    <w:p>
+      <w:r>
+        <w:t>- Existe variación entre días.</w:t>
+      </w:r>
+    </w:p>
+    <w:p>
+      <w:r>
+        <w:t>- Los tests anteriores pasan.</w:t>
+      </w:r>
+    </w:p>
+    <w:p>
+      <w:r>
+        <w:lastRenderedPageBreak/>
         <w:t>- Los nuevos tests pasan.</w:t>
       </w:r>
     </w:p>
     <w:p>
       <w:r>
-        <w:t>- No se persisten dietas.</w:t>
-      </w:r>
-    </w:p>
-    <w:p>
-      <w:r>
-        <w:t>- No se exponen secretos.</w:t>
+        <w:t>- Frontend inicia correctamente.</w:t>
+      </w:r>
+    </w:p>
+    <w:p>
+      <w:r>
+        <w:t>- React obtiene datos reales del backend.</w:t>
+      </w:r>
+    </w:p>
+    <w:p>
+      <w:r>
+        <w:t>- La pantalla muestra el plan.</w:t>
+      </w:r>
+    </w:p>
+    <w:p>
+      <w:r>
+        <w:t>- Se pueden cambiar los 14 días.</w:t>
+      </w:r>
+    </w:p>
+    <w:p>
+      <w:r>
+        <w:t>- Todo funciona en localhost.</w:t>
+      </w:r>
+    </w:p>
+    <w:p>
+      <w:r>
+        <w:t>- No hay secretos expuestos.</w:t>
       </w:r>
     </w:p>
     <w:p>
@@ -902,182 +1658,7 @@
     <w:p/>
     <w:p>
       <w:r>
-        <w:lastRenderedPageBreak/>
-        <w:t>Si encuentras problemas, corrige únicamente lo necesario.</w:t>
-      </w:r>
-    </w:p>
-    <w:p/>
-    <w:p>
-      <w:r>
-        <w:t>LÍMITES ABSOLUTOS</w:t>
-      </w:r>
-    </w:p>
-    <w:p/>
-    <w:p>
-      <w:r>
-        <w:t>NO implementar todavía:</w:t>
-      </w:r>
-    </w:p>
-    <w:p/>
-    <w:p>
-      <w:r>
-        <w:t>- dieta de 14 días</w:t>
-      </w:r>
-    </w:p>
-    <w:p>
-      <w:r>
-        <w:t>- calendario</w:t>
-      </w:r>
-    </w:p>
-    <w:p>
-      <w:r>
-        <w:t>- recetas completas</w:t>
-      </w:r>
-    </w:p>
-    <w:p>
-      <w:r>
-        <w:t>- catálogo grande de alimentos</w:t>
-      </w:r>
-    </w:p>
-    <w:p>
-      <w:r>
-        <w:t>- lista de supermercado</w:t>
-      </w:r>
-    </w:p>
-    <w:p>
-      <w:r>
-        <w:t>- comparación de supermercados</w:t>
-      </w:r>
-    </w:p>
-    <w:p>
-      <w:r>
-        <w:t>- geolocalización</w:t>
-      </w:r>
-    </w:p>
-    <w:p>
-      <w:r>
-        <w:t>- diagnóstico</w:t>
-      </w:r>
-    </w:p>
-    <w:p>
-      <w:r>
-        <w:t>- enfermedades</w:t>
-      </w:r>
-    </w:p>
-    <w:p>
-      <w:r>
-        <w:t>- recomendaciones clínicas</w:t>
-      </w:r>
-    </w:p>
-    <w:p>
-      <w:r>
-        <w:t>- chatbot</w:t>
-      </w:r>
-    </w:p>
-    <w:p>
-      <w:r>
-        <w:t>- IA</w:t>
-      </w:r>
-    </w:p>
-    <w:p>
-      <w:r>
-        <w:t>- autenticación</w:t>
-      </w:r>
-    </w:p>
-    <w:p>
-      <w:r>
-        <w:t>- roles</w:t>
-      </w:r>
-    </w:p>
-    <w:p>
-      <w:r>
-        <w:t>- frontend</w:t>
-      </w:r>
-    </w:p>
-    <w:p>
-      <w:r>
-        <w:t>- Excel</w:t>
-      </w:r>
-    </w:p>
-    <w:p>
-      <w:r>
-        <w:t>- integraciones externas</w:t>
-      </w:r>
-    </w:p>
-    <w:p>
-      <w:r>
-        <w:t>- Docker</w:t>
-      </w:r>
-    </w:p>
-    <w:p>
-      <w:r>
-        <w:t>- microservicios</w:t>
-      </w:r>
-    </w:p>
-    <w:p>
-      <w:r>
-        <w:t>- arquitectura enterprise</w:t>
-      </w:r>
-    </w:p>
-    <w:p/>
-    <w:p>
-      <w:r>
-        <w:t>PRINCIPIO DE DISEÑO</w:t>
-      </w:r>
-    </w:p>
-    <w:p/>
-    <w:p>
-      <w:r>
-        <w:t>No intentes resolver todavía la dieta perfecta.</w:t>
-      </w:r>
-    </w:p>
-    <w:p/>
-    <w:p>
-      <w:r>
-        <w:t>Queremos demostrar primero este flujo:</w:t>
-      </w:r>
-    </w:p>
-    <w:p/>
-    <w:p>
-      <w:r>
-        <w:t>PACIENTE</w:t>
-      </w:r>
-    </w:p>
-    <w:p>
-      <w:r>
-        <w:t>→ OBJETIVO NUTRICIONAL</w:t>
-      </w:r>
-    </w:p>
-    <w:p>
-      <w:r>
-        <w:t>→ DIETA DIARIA</w:t>
-      </w:r>
-    </w:p>
-    <w:p>
-      <w:r>
-        <w:t>→ TOTALES VERIFICABLES</w:t>
-      </w:r>
-    </w:p>
-    <w:p/>
-    <w:p>
-      <w:r>
-        <w:t>Si funciona correctamente, la siguiente iteración podrá profundizar el</w:t>
-      </w:r>
-    </w:p>
-    <w:p>
-      <w:r>
-        <w:t>catálogo de alimentos y posteriormente convertir una dieta diaria en un</w:t>
-      </w:r>
-    </w:p>
-    <w:p>
-      <w:r>
-        <w:t>plan de varios días.</w:t>
-      </w:r>
-    </w:p>
-    <w:p/>
-    <w:p>
-      <w:r>
-        <w:t>Al finalizar responde únicamente con:</w:t>
+        <w:t>Al finalizar responde:</w:t>
       </w:r>
     </w:p>
     <w:p/>
@@ -1093,32 +1674,52 @@
     </w:p>
     <w:p>
       <w:r>
-        <w:t>3. Estructura relevante.</w:t>
-      </w:r>
-    </w:p>
-    <w:p>
-      <w:r>
-        <w:t>4. Cómo funciona el generador.</w:t>
-      </w:r>
-    </w:p>
-    <w:p>
-      <w:r>
-        <w:t>5. Ejemplo de resultado.</w:t>
-      </w:r>
-    </w:p>
-    <w:p>
-      <w:r>
-        <w:t>6. Tests y verificaciones.</w:t>
-      </w:r>
-    </w:p>
-    <w:p>
-      <w:r>
-        <w:t>7. Commit creado.</w:t>
-      </w:r>
-    </w:p>
-    <w:p>
-      <w:r>
-        <w:t>8. Bloqueos reales.</w:t>
+        <w:t>3. Qué archivos modificaste/creaste.</w:t>
+      </w:r>
+    </w:p>
+    <w:p>
+      <w:r>
+        <w:t>4. Cómo ejecutar backend.</w:t>
+      </w:r>
+    </w:p>
+    <w:p>
+      <w:r>
+        <w:t>5. Cómo ejecutar frontend.</w:t>
+      </w:r>
+    </w:p>
+    <w:p>
+      <w:r>
+        <w:t>6. URL local del frontend.</w:t>
+      </w:r>
+    </w:p>
+    <w:p>
+      <w:r>
+        <w:t>7. URL local del backend.</w:t>
+      </w:r>
+    </w:p>
+    <w:p>
+      <w:r>
+        <w:t>8. Qué puedo visualizar ahora.</w:t>
+      </w:r>
+    </w:p>
+    <w:p>
+      <w:r>
+        <w:t>9. Tests ejecutados.</w:t>
+      </w:r>
+    </w:p>
+    <w:p>
+      <w:r>
+        <w:t>10. Verificaciones.</w:t>
+      </w:r>
+    </w:p>
+    <w:p>
+      <w:r>
+        <w:t>11. Commit creado.</w:t>
+      </w:r>
+    </w:p>
+    <w:p>
+      <w:r>
+        <w:t>12. Bloqueos reales.</w:t>
       </w:r>
     </w:p>
     <w:p/>
@@ -1545,7 +2146,7 @@
     <w:link w:val="Ttulo1Car"/>
     <w:uiPriority w:val="9"/>
     <w:qFormat/>
-    <w:rsid w:val="007B4876"/>
+    <w:rsid w:val="005F684A"/>
     <w:pPr>
       <w:keepNext/>
       <w:keepLines/>
@@ -1568,7 +2169,7 @@
     <w:semiHidden/>
     <w:unhideWhenUsed/>
     <w:qFormat/>
-    <w:rsid w:val="007B4876"/>
+    <w:rsid w:val="005F684A"/>
     <w:pPr>
       <w:keepNext/>
       <w:keepLines/>
@@ -1591,7 +2192,7 @@
     <w:semiHidden/>
     <w:unhideWhenUsed/>
     <w:qFormat/>
-    <w:rsid w:val="007B4876"/>
+    <w:rsid w:val="005F684A"/>
     <w:pPr>
       <w:keepNext/>
       <w:keepLines/>
@@ -1614,7 +2215,7 @@
     <w:semiHidden/>
     <w:unhideWhenUsed/>
     <w:qFormat/>
-    <w:rsid w:val="007B4876"/>
+    <w:rsid w:val="005F684A"/>
     <w:pPr>
       <w:keepNext/>
       <w:keepLines/>
@@ -1637,7 +2238,7 @@
     <w:semiHidden/>
     <w:unhideWhenUsed/>
     <w:qFormat/>
-    <w:rsid w:val="007B4876"/>
+    <w:rsid w:val="005F684A"/>
     <w:pPr>
       <w:keepNext/>
       <w:keepLines/>
@@ -1658,7 +2259,7 @@
     <w:semiHidden/>
     <w:unhideWhenUsed/>
     <w:qFormat/>
-    <w:rsid w:val="007B4876"/>
+    <w:rsid w:val="005F684A"/>
     <w:pPr>
       <w:keepNext/>
       <w:keepLines/>
@@ -1681,7 +2282,7 @@
     <w:semiHidden/>
     <w:unhideWhenUsed/>
     <w:qFormat/>
-    <w:rsid w:val="007B4876"/>
+    <w:rsid w:val="005F684A"/>
     <w:pPr>
       <w:keepNext/>
       <w:keepLines/>
@@ -1702,7 +2303,7 @@
     <w:semiHidden/>
     <w:unhideWhenUsed/>
     <w:qFormat/>
-    <w:rsid w:val="007B4876"/>
+    <w:rsid w:val="005F684A"/>
     <w:pPr>
       <w:keepNext/>
       <w:keepLines/>
@@ -1725,7 +2326,7 @@
     <w:semiHidden/>
     <w:unhideWhenUsed/>
     <w:qFormat/>
-    <w:rsid w:val="007B4876"/>
+    <w:rsid w:val="005F684A"/>
     <w:pPr>
       <w:keepNext/>
       <w:keepLines/>
@@ -1769,7 +2370,7 @@
     <w:basedOn w:val="Fuentedeprrafopredeter"/>
     <w:link w:val="Ttulo1"/>
     <w:uiPriority w:val="9"/>
-    <w:rsid w:val="007B4876"/>
+    <w:rsid w:val="005F684A"/>
     <w:rPr>
       <w:rFonts w:asciiTheme="majorHAnsi" w:eastAsiaTheme="majorEastAsia" w:hAnsiTheme="majorHAnsi" w:cstheme="majorBidi"/>
       <w:color w:val="0F4761" w:themeColor="accent1" w:themeShade="BF"/>
@@ -1783,7 +2384,7 @@
     <w:link w:val="Ttulo2"/>
     <w:uiPriority w:val="9"/>
     <w:semiHidden/>
-    <w:rsid w:val="007B4876"/>
+    <w:rsid w:val="005F684A"/>
     <w:rPr>
       <w:rFonts w:asciiTheme="majorHAnsi" w:eastAsiaTheme="majorEastAsia" w:hAnsiTheme="majorHAnsi" w:cstheme="majorBidi"/>
       <w:color w:val="0F4761" w:themeColor="accent1" w:themeShade="BF"/>
@@ -1797,7 +2398,7 @@
     <w:link w:val="Ttulo3"/>
     <w:uiPriority w:val="9"/>
     <w:semiHidden/>
-    <w:rsid w:val="007B4876"/>
+    <w:rsid w:val="005F684A"/>
     <w:rPr>
       <w:rFonts w:eastAsiaTheme="majorEastAsia" w:cstheme="majorBidi"/>
       <w:color w:val="0F4761" w:themeColor="accent1" w:themeShade="BF"/>
@@ -1811,7 +2412,7 @@
     <w:link w:val="Ttulo4"/>
     <w:uiPriority w:val="9"/>
     <w:semiHidden/>
-    <w:rsid w:val="007B4876"/>
+    <w:rsid w:val="005F684A"/>
     <w:rPr>
       <w:rFonts w:eastAsiaTheme="majorEastAsia" w:cstheme="majorBidi"/>
       <w:i/>
@@ -1825,7 +2426,7 @@
     <w:link w:val="Ttulo5"/>
     <w:uiPriority w:val="9"/>
     <w:semiHidden/>
-    <w:rsid w:val="007B4876"/>
+    <w:rsid w:val="005F684A"/>
     <w:rPr>
       <w:rFonts w:eastAsiaTheme="majorEastAsia" w:cstheme="majorBidi"/>
       <w:color w:val="0F4761" w:themeColor="accent1" w:themeShade="BF"/>
@@ -1837,7 +2438,7 @@
     <w:link w:val="Ttulo6"/>
     <w:uiPriority w:val="9"/>
     <w:semiHidden/>
-    <w:rsid w:val="007B4876"/>
+    <w:rsid w:val="005F684A"/>
     <w:rPr>
       <w:rFonts w:eastAsiaTheme="majorEastAsia" w:cstheme="majorBidi"/>
       <w:i/>
@@ -1851,7 +2452,7 @@
     <w:link w:val="Ttulo7"/>
     <w:uiPriority w:val="9"/>
     <w:semiHidden/>
-    <w:rsid w:val="007B4876"/>
+    <w:rsid w:val="005F684A"/>
     <w:rPr>
       <w:rFonts w:eastAsiaTheme="majorEastAsia" w:cstheme="majorBidi"/>
       <w:color w:val="595959" w:themeColor="text1" w:themeTint="A6"/>
@@ -1863,7 +2464,7 @@
     <w:link w:val="Ttulo8"/>
     <w:uiPriority w:val="9"/>
     <w:semiHidden/>
-    <w:rsid w:val="007B4876"/>
+    <w:rsid w:val="005F684A"/>
     <w:rPr>
       <w:rFonts w:eastAsiaTheme="majorEastAsia" w:cstheme="majorBidi"/>
       <w:i/>
@@ -1877,7 +2478,7 @@
     <w:link w:val="Ttulo9"/>
     <w:uiPriority w:val="9"/>
     <w:semiHidden/>
-    <w:rsid w:val="007B4876"/>
+    <w:rsid w:val="005F684A"/>
     <w:rPr>
       <w:rFonts w:eastAsiaTheme="majorEastAsia" w:cstheme="majorBidi"/>
       <w:color w:val="272727" w:themeColor="text1" w:themeTint="D8"/>
@@ -1890,7 +2491,7 @@
     <w:link w:val="TtuloCar"/>
     <w:uiPriority w:val="10"/>
     <w:qFormat/>
-    <w:rsid w:val="007B4876"/>
+    <w:rsid w:val="005F684A"/>
     <w:pPr>
       <w:spacing w:after="80" w:line="240" w:lineRule="auto"/>
       <w:contextualSpacing/>
@@ -1908,7 +2509,7 @@
     <w:basedOn w:val="Fuentedeprrafopredeter"/>
     <w:link w:val="Ttulo"/>
     <w:uiPriority w:val="10"/>
-    <w:rsid w:val="007B4876"/>
+    <w:rsid w:val="005F684A"/>
     <w:rPr>
       <w:rFonts w:asciiTheme="majorHAnsi" w:eastAsiaTheme="majorEastAsia" w:hAnsiTheme="majorHAnsi" w:cstheme="majorBidi"/>
       <w:spacing w:val="-10"/>
@@ -1924,7 +2525,7 @@
     <w:link w:val="SubttuloCar"/>
     <w:uiPriority w:val="11"/>
     <w:qFormat/>
-    <w:rsid w:val="007B4876"/>
+    <w:rsid w:val="005F684A"/>
     <w:pPr>
       <w:numPr>
         <w:ilvl w:val="1"/>
@@ -1943,7 +2544,7 @@
     <w:basedOn w:val="Fuentedeprrafopredeter"/>
     <w:link w:val="Subttulo"/>
     <w:uiPriority w:val="11"/>
-    <w:rsid w:val="007B4876"/>
+    <w:rsid w:val="005F684A"/>
     <w:rPr>
       <w:rFonts w:eastAsiaTheme="majorEastAsia" w:cstheme="majorBidi"/>
       <w:color w:val="595959" w:themeColor="text1" w:themeTint="A6"/>
@@ -1959,7 +2560,7 @@
     <w:link w:val="CitaCar"/>
     <w:uiPriority w:val="29"/>
     <w:qFormat/>
-    <w:rsid w:val="007B4876"/>
+    <w:rsid w:val="005F684A"/>
     <w:pPr>
       <w:spacing w:before="160"/>
       <w:jc w:val="center"/>
@@ -1975,7 +2576,7 @@
     <w:basedOn w:val="Fuentedeprrafopredeter"/>
     <w:link w:val="Cita"/>
     <w:uiPriority w:val="29"/>
-    <w:rsid w:val="007B4876"/>
+    <w:rsid w:val="005F684A"/>
     <w:rPr>
       <w:i/>
       <w:iCs/>
@@ -1987,7 +2588,7 @@
     <w:basedOn w:val="Normal"/>
     <w:uiPriority w:val="34"/>
     <w:qFormat/>
-    <w:rsid w:val="007B4876"/>
+    <w:rsid w:val="005F684A"/>
     <w:pPr>
       <w:ind w:left="720"/>
       <w:contextualSpacing/>
@@ -1998,7 +2599,7 @@
     <w:basedOn w:val="Fuentedeprrafopredeter"/>
     <w:uiPriority w:val="21"/>
     <w:qFormat/>
-    <w:rsid w:val="007B4876"/>
+    <w:rsid w:val="005F684A"/>
     <w:rPr>
       <w:i/>
       <w:iCs/>
@@ -2012,7 +2613,7 @@
     <w:link w:val="CitadestacadaCar"/>
     <w:uiPriority w:val="30"/>
     <w:qFormat/>
-    <w:rsid w:val="007B4876"/>
+    <w:rsid w:val="005F684A"/>
     <w:pPr>
       <w:pBdr>
         <w:top w:val="single" w:sz="4" w:space="10" w:color="0F4761" w:themeColor="accent1" w:themeShade="BF"/>
@@ -2033,7 +2634,7 @@
     <w:basedOn w:val="Fuentedeprrafopredeter"/>
     <w:link w:val="Citadestacada"/>
     <w:uiPriority w:val="30"/>
-    <w:rsid w:val="007B4876"/>
+    <w:rsid w:val="005F684A"/>
     <w:rPr>
       <w:i/>
       <w:iCs/>
@@ -2045,7 +2646,7 @@
     <w:basedOn w:val="Fuentedeprrafopredeter"/>
     <w:uiPriority w:val="32"/>
     <w:qFormat/>
-    <w:rsid w:val="007B4876"/>
+    <w:rsid w:val="005F684A"/>
     <w:rPr>
       <w:b/>
       <w:bCs/>
@@ -2053,6 +2654,15 @@
       <w:color w:val="0F4761" w:themeColor="accent1" w:themeShade="BF"/>
       <w:spacing w:val="5"/>
     </w:rPr>
+  </w:style>
+  <w:style w:type="paragraph" w:styleId="Sinespaciado">
+    <w:name w:val="No Spacing"/>
+    <w:uiPriority w:val="1"/>
+    <w:qFormat/>
+    <w:rsid w:val="005F684A"/>
+    <w:pPr>
+      <w:spacing w:after="0" w:line="240" w:lineRule="auto"/>
+    </w:pPr>
   </w:style>
 </w:styles>
 </file>

</xml_diff>